<commit_message>
Deploying to gh-pages from @ Morrison-Lab/cds@c2cdce6abab2712dac8781329fce1b4710779666 🚀
</commit_message>
<xml_diff>
--- a/asymptotic-notation.docx
+++ b/asymptotic-notation.docx
@@ -15,7 +15,7 @@
         <w:pStyle w:val="Date"/>
       </w:pPr>
       <w:r>
-        <w:t xml:space="preserve">Last modified: 2026-10-24 21:50:07 (PDT)</w:t>
+        <w:t xml:space="preserve">Last modified: 2026-10-24 21:55:03 (PDT)</w:t>
       </w:r>
     </w:p>
     <w:p>
@@ -2586,56 +2586,9 @@
       <w:r>
         <w:t xml:space="preserve"> </w:t>
       </w:r>
-      <m:oMath>
-        <m:acc>
-          <m:accPr>
-            <m:chr m:val="̃"/>
-          </m:accPr>
-          <m:e>
-            <m:r>
-              <m:t>x</m:t>
-            </m:r>
-          </m:e>
-        </m:acc>
-        <m:r>
-          <m:rPr>
-            <m:sty m:val="p"/>
-          </m:rPr>
-          <m:t>,</m:t>
-        </m:r>
-        <m:acc>
-          <m:accPr>
-            <m:chr m:val="̃"/>
-          </m:accPr>
-          <m:e>
-            <m:r>
-              <m:t>z</m:t>
-            </m:r>
-          </m:e>
-        </m:acc>
-        <m:r>
-          <m:rPr>
-            <m:sty m:val="p"/>
-          </m:rPr>
-          <m:t>∈</m:t>
-        </m:r>
-        <m:sSup>
-          <m:e>
-            <m:r>
-              <m:rPr>
-                <m:scr m:val="double-struck"/>
-                <m:sty m:val="p"/>
-              </m:rPr>
-              <m:t>R</m:t>
-            </m:r>
-          </m:e>
-          <m:sup>
-            <m:r>
-              <m:t>D</m:t>
-            </m:r>
-          </m:sup>
-        </m:sSup>
-      </m:oMath>
+      <w:r>
+        <w:t xml:space="preserve">$\mathord{\smash[b]{\underset{\raise.3ex\hbox{$\scriptstyle\sim$}}{x}}\vphantom{x}}, \mathord{\smash[b]{\underset{\raise.3ex\hbox{$\scriptstyle\sim$}}{z}}\vphantom{z}}\in \mathbb{R}^D$</w:t>
+      </w:r>
       <w:r>
         <w:t xml:space="preserve"> </w:t>
       </w:r>
@@ -2647,153 +2600,9 @@
       <w:pPr>
         <w:pStyle w:val="BodyText"/>
       </w:pPr>
-      <m:oMathPara>
-        <m:oMathParaPr>
-          <m:jc m:val="center"/>
-        </m:oMathParaPr>
-        <m:oMath>
-          <m:sSup>
-            <m:e>
-              <m:acc>
-                <m:accPr>
-                  <m:chr m:val="̃"/>
-                </m:accPr>
-                <m:e>
-                  <m:r>
-                    <m:t>x</m:t>
-                  </m:r>
-                </m:e>
-              </m:acc>
-            </m:e>
-            <m:sup>
-              <m:r>
-                <m:rPr>
-                  <m:sty m:val="p"/>
-                </m:rPr>
-                <m:t>⊤</m:t>
-              </m:r>
-            </m:sup>
-          </m:sSup>
-          <m:acc>
-            <m:accPr>
-              <m:chr m:val="̃"/>
-            </m:accPr>
-            <m:e>
-              <m:r>
-                <m:t>z</m:t>
-              </m:r>
-            </m:e>
-          </m:acc>
-          <m:r>
-            <m:rPr>
-              <m:sty m:val="p"/>
-            </m:rPr>
-            <m:t>=</m:t>
-          </m:r>
-          <m:sSub>
-            <m:e>
-              <m:r>
-                <m:t>x</m:t>
-              </m:r>
-            </m:e>
-            <m:sub>
-              <m:r>
-                <m:t>1</m:t>
-              </m:r>
-            </m:sub>
-          </m:sSub>
-          <m:sSub>
-            <m:e>
-              <m:r>
-                <m:t>z</m:t>
-              </m:r>
-            </m:e>
-            <m:sub>
-              <m:r>
-                <m:t>1</m:t>
-              </m:r>
-            </m:sub>
-          </m:sSub>
-          <m:r>
-            <m:rPr>
-              <m:sty m:val="p"/>
-            </m:rPr>
-            <m:t>+</m:t>
-          </m:r>
-          <m:sSub>
-            <m:e>
-              <m:r>
-                <m:t>x</m:t>
-              </m:r>
-            </m:e>
-            <m:sub>
-              <m:r>
-                <m:t>2</m:t>
-              </m:r>
-            </m:sub>
-          </m:sSub>
-          <m:sSub>
-            <m:e>
-              <m:r>
-                <m:t>z</m:t>
-              </m:r>
-            </m:e>
-            <m:sub>
-              <m:r>
-                <m:t>2</m:t>
-              </m:r>
-            </m:sub>
-          </m:sSub>
-          <m:r>
-            <m:rPr>
-              <m:sty m:val="p"/>
-            </m:rPr>
-            <m:t>+</m:t>
-          </m:r>
-          <m:r>
-            <m:rPr>
-              <m:sty m:val="p"/>
-            </m:rPr>
-            <m:t>⋯</m:t>
-          </m:r>
-          <m:r>
-            <m:rPr>
-              <m:sty m:val="p"/>
-            </m:rPr>
-            <m:t>+</m:t>
-          </m:r>
-          <m:sSub>
-            <m:e>
-              <m:r>
-                <m:t>x</m:t>
-              </m:r>
-            </m:e>
-            <m:sub>
-              <m:r>
-                <m:t>D</m:t>
-              </m:r>
-            </m:sub>
-          </m:sSub>
-          <m:sSub>
-            <m:e>
-              <m:r>
-                <m:t>z</m:t>
-              </m:r>
-            </m:e>
-            <m:sub>
-              <m:r>
-                <m:t>D</m:t>
-              </m:r>
-            </m:sub>
-          </m:sSub>
-          <m:r>
-            <m:rPr>
-              <m:sty m:val="p"/>
-            </m:rPr>
-            <m:t>.</m:t>
-          </m:r>
-        </m:oMath>
-      </m:oMathPara>
+      <w:r>
+        <w:t xml:space="preserve">$$\mathord{\smash[b]{\underset{\raise.3ex\hbox{$\scriptstyle\sim$}}{x}}\vphantom{x}}^\top \mathord{\smash[b]{\underset{\raise.3ex\hbox{$\scriptstyle\sim$}}{z}}\vphantom{z}}= x_1 z_1 + x_2 z_2 + \cdots + x_D z_D.$$</w:t>
+      </w:r>
     </w:p>
     <w:p>
       <w:pPr>

</xml_diff>

<commit_message>
Deploying to gh-pages from @ Morrison-Lab/cds@442f82cde2c604949cd928439d4e0f1e7d6dba62 🚀
</commit_message>
<xml_diff>
--- a/asymptotic-notation.docx
+++ b/asymptotic-notation.docx
@@ -15,7 +15,7 @@
         <w:pStyle w:val="Date"/>
       </w:pPr>
       <w:r>
-        <w:t xml:space="preserve">Last modified: 2026-10-29 18:15:54 (PDT)</w:t>
+        <w:t xml:space="preserve">Last modified: 2026-10-30 13:54:17 (PDT)</w:t>
       </w:r>
     </w:p>
     <w:p>
@@ -1434,16 +1434,16 @@
     </w:p>
     <w:bookmarkEnd w:id="12"/>
     <w:bookmarkEnd w:id="13"/>
-    <w:bookmarkStart w:id="16" w:name="sec-asymptotic-examples"/>
+    <w:bookmarkStart w:id="17" w:name="sec-asymptotic-dominance"/>
     <w:p>
       <w:pPr>
         <w:pStyle w:val="Heading2"/>
       </w:pPr>
       <w:r>
-        <w:t xml:space="preserve">2 Examples</w:t>
+        <w:t xml:space="preserve">2 Dominance</w:t>
       </w:r>
     </w:p>
-    <w:bookmarkStart w:id="14" w:name="exm-quadratic-big-o"/>
+    <w:bookmarkStart w:id="14" w:name="def-little-o"/>
     <w:p>
       <w:pPr>
         <w:pStyle w:val="FirstParagraph"/>
@@ -1453,7 +1453,1048 @@
           <w:b/>
           <w:bCs/>
         </w:rPr>
-        <w:t xml:space="preserve">Example 1 (A quadratic is</w:t>
+        <w:t xml:space="preserve">Definition 4 (Little-o notation (dominates))</w:t>
+      </w:r>
+      <w:r>
+        <w:t xml:space="preserve"> </w:t>
+      </w:r>
+      <w:r>
+        <w:t xml:space="preserve">Let</w:t>
+      </w:r>
+      <w:r>
+        <w:t xml:space="preserve"> </w:t>
+      </w:r>
+      <m:oMath>
+        <m:r>
+          <m:t>f</m:t>
+        </m:r>
+      </m:oMath>
+      <w:r>
+        <w:t xml:space="preserve"> </w:t>
+      </w:r>
+      <w:r>
+        <w:t xml:space="preserve">and</w:t>
+      </w:r>
+      <w:r>
+        <w:t xml:space="preserve"> </w:t>
+      </w:r>
+      <m:oMath>
+        <m:r>
+          <m:t>g</m:t>
+        </m:r>
+      </m:oMath>
+      <w:r>
+        <w:t xml:space="preserve"> </w:t>
+      </w:r>
+      <w:r>
+        <w:t xml:space="preserve">be functions from the positive integers to</w:t>
+      </w:r>
+      <w:r>
+        <w:t xml:space="preserve"> </w:t>
+      </w:r>
+      <m:oMath>
+        <m:r>
+          <m:rPr>
+            <m:sty m:val="p"/>
+          </m:rPr>
+          <m:t>[</m:t>
+        </m:r>
+        <m:r>
+          <m:t>0</m:t>
+        </m:r>
+        <m:r>
+          <m:rPr>
+            <m:sty m:val="p"/>
+          </m:rPr>
+          <m:t>,</m:t>
+        </m:r>
+        <m:r>
+          <m:rPr>
+            <m:sty m:val="p"/>
+          </m:rPr>
+          <m:t>∞</m:t>
+        </m:r>
+        <m:r>
+          <m:rPr>
+            <m:sty m:val="p"/>
+          </m:rPr>
+          <m:t>)</m:t>
+        </m:r>
+      </m:oMath>
+      <w:r>
+        <w:t xml:space="preserve"> </w:t>
+      </w:r>
+      <w:r>
+        <w:t xml:space="preserve">with</w:t>
+      </w:r>
+      <w:r>
+        <w:t xml:space="preserve"> </w:t>
+      </w:r>
+      <m:oMath>
+        <m:r>
+          <m:t>g</m:t>
+        </m:r>
+        <m:r>
+          <m:rPr>
+            <m:sty m:val="p"/>
+          </m:rPr>
+          <m:t>(</m:t>
+        </m:r>
+        <m:r>
+          <m:t>n</m:t>
+        </m:r>
+        <m:r>
+          <m:rPr>
+            <m:sty m:val="p"/>
+          </m:rPr>
+          <m:t>)</m:t>
+        </m:r>
+        <m:r>
+          <m:rPr>
+            <m:sty m:val="p"/>
+          </m:rPr>
+          <m:t>&gt;</m:t>
+        </m:r>
+        <m:r>
+          <m:t>0</m:t>
+        </m:r>
+      </m:oMath>
+      <w:r>
+        <w:t xml:space="preserve"> </w:t>
+      </w:r>
+      <w:r>
+        <w:t xml:space="preserve">for every</w:t>
+      </w:r>
+      <w:r>
+        <w:t xml:space="preserve"> </w:t>
+      </w:r>
+      <m:oMath>
+        <m:r>
+          <m:t>n</m:t>
+        </m:r>
+      </m:oMath>
+      <w:r>
+        <w:t xml:space="preserve">.</w:t>
+      </w:r>
+      <w:r>
+        <w:t xml:space="preserve"> </w:t>
+      </w:r>
+      <w:r>
+        <w:t xml:space="preserve">We write</w:t>
+      </w:r>
+      <w:r>
+        <w:t xml:space="preserve"> </w:t>
+      </w:r>
+      <m:oMath>
+        <m:r>
+          <m:t>f</m:t>
+        </m:r>
+        <m:r>
+          <m:rPr>
+            <m:sty m:val="p"/>
+          </m:rPr>
+          <m:t>(</m:t>
+        </m:r>
+        <m:r>
+          <m:t>n</m:t>
+        </m:r>
+        <m:r>
+          <m:rPr>
+            <m:sty m:val="p"/>
+          </m:rPr>
+          <m:t>)</m:t>
+        </m:r>
+        <m:r>
+          <m:rPr>
+            <m:sty m:val="p"/>
+          </m:rPr>
+          <m:t>=</m:t>
+        </m:r>
+        <m:r>
+          <m:t>o</m:t>
+        </m:r>
+        <m:r>
+          <m:rPr>
+            <m:sty m:val="p"/>
+          </m:rPr>
+          <m:t>(</m:t>
+        </m:r>
+        <m:r>
+          <m:t>g</m:t>
+        </m:r>
+        <m:r>
+          <m:rPr>
+            <m:sty m:val="p"/>
+          </m:rPr>
+          <m:t>(</m:t>
+        </m:r>
+        <m:r>
+          <m:t>n</m:t>
+        </m:r>
+        <m:r>
+          <m:rPr>
+            <m:sty m:val="p"/>
+          </m:rPr>
+          <m:t>)</m:t>
+        </m:r>
+        <m:r>
+          <m:rPr>
+            <m:sty m:val="p"/>
+          </m:rPr>
+          <m:t>)</m:t>
+        </m:r>
+      </m:oMath>
+      <w:r>
+        <w:t xml:space="preserve"> </w:t>
+      </w:r>
+      <w:r>
+        <w:t xml:space="preserve">if, for every constant</w:t>
+      </w:r>
+      <w:r>
+        <w:t xml:space="preserve"> </w:t>
+      </w:r>
+      <m:oMath>
+        <m:r>
+          <m:t>ε</m:t>
+        </m:r>
+        <m:r>
+          <m:rPr>
+            <m:sty m:val="p"/>
+          </m:rPr>
+          <m:t>&gt;</m:t>
+        </m:r>
+        <m:r>
+          <m:t>0</m:t>
+        </m:r>
+      </m:oMath>
+      <w:r>
+        <w:t xml:space="preserve">,</w:t>
+      </w:r>
+      <w:r>
+        <w:t xml:space="preserve"> </w:t>
+      </w:r>
+      <w:r>
+        <w:t xml:space="preserve">there is an integer</w:t>
+      </w:r>
+      <w:r>
+        <w:t xml:space="preserve"> </w:t>
+      </w:r>
+      <m:oMath>
+        <m:sSub>
+          <m:e>
+            <m:r>
+              <m:t>n</m:t>
+            </m:r>
+          </m:e>
+          <m:sub>
+            <m:r>
+              <m:t>0</m:t>
+            </m:r>
+          </m:sub>
+        </m:sSub>
+      </m:oMath>
+      <w:r>
+        <w:t xml:space="preserve"> </w:t>
+      </w:r>
+      <w:r>
+        <w:t xml:space="preserve">such that</w:t>
+      </w:r>
+    </w:p>
+    <w:p>
+      <w:pPr>
+        <w:pStyle w:val="BodyText"/>
+      </w:pPr>
+      <m:oMathPara>
+        <m:oMathParaPr>
+          <m:jc m:val="center"/>
+        </m:oMathParaPr>
+        <m:oMath>
+          <m:r>
+            <m:t>f</m:t>
+          </m:r>
+          <m:r>
+            <m:rPr>
+              <m:sty m:val="p"/>
+            </m:rPr>
+            <m:t>(</m:t>
+          </m:r>
+          <m:r>
+            <m:t>n</m:t>
+          </m:r>
+          <m:r>
+            <m:rPr>
+              <m:sty m:val="p"/>
+            </m:rPr>
+            <m:t>)</m:t>
+          </m:r>
+          <m:r>
+            <m:rPr>
+              <m:sty m:val="p"/>
+            </m:rPr>
+            <m:t>≤</m:t>
+          </m:r>
+          <m:r>
+            <m:t>ε</m:t>
+          </m:r>
+          <m:r>
+            <m:t> </m:t>
+          </m:r>
+          <m:r>
+            <m:t>g</m:t>
+          </m:r>
+          <m:r>
+            <m:rPr>
+              <m:sty m:val="p"/>
+            </m:rPr>
+            <m:t>(</m:t>
+          </m:r>
+          <m:r>
+            <m:t>n</m:t>
+          </m:r>
+          <m:r>
+            <m:rPr>
+              <m:sty m:val="p"/>
+            </m:rPr>
+            <m:t>)</m:t>
+          </m:r>
+          <m:r>
+            <m:t> </m:t>
+          </m:r>
+          <m:r>
+            <m:rPr>
+              <m:nor/>
+              <m:sty m:val="p"/>
+            </m:rPr>
+            <m:t>for every </m:t>
+          </m:r>
+          <m:r>
+            <m:t>n</m:t>
+          </m:r>
+          <m:r>
+            <m:rPr>
+              <m:sty m:val="p"/>
+            </m:rPr>
+            <m:t>≥</m:t>
+          </m:r>
+          <m:sSub>
+            <m:e>
+              <m:r>
+                <m:t>n</m:t>
+              </m:r>
+            </m:e>
+            <m:sub>
+              <m:r>
+                <m:t>0</m:t>
+              </m:r>
+            </m:sub>
+          </m:sSub>
+          <m:r>
+            <m:rPr>
+              <m:sty m:val="p"/>
+            </m:rPr>
+            <m:t>.</m:t>
+          </m:r>
+        </m:oMath>
+      </m:oMathPara>
+    </w:p>
+    <w:p>
+      <w:pPr>
+        <w:pStyle w:val="FirstParagraph"/>
+      </w:pPr>
+      <w:r>
+        <w:t xml:space="preserve">That is,</w:t>
+      </w:r>
+      <w:r>
+        <w:t xml:space="preserve"> </w:t>
+      </w:r>
+      <m:oMath>
+        <m:r>
+          <m:t>f</m:t>
+        </m:r>
+      </m:oMath>
+      <w:r>
+        <w:t xml:space="preserve"> </w:t>
+      </w:r>
+      <w:r>
+        <w:t xml:space="preserve">is eventually smaller than any fixed fraction of</w:t>
+      </w:r>
+      <w:r>
+        <w:t xml:space="preserve"> </w:t>
+      </w:r>
+      <m:oMath>
+        <m:r>
+          <m:t>g</m:t>
+        </m:r>
+      </m:oMath>
+      <w:r>
+        <w:t xml:space="preserve">,</w:t>
+      </w:r>
+      <w:r>
+        <w:t xml:space="preserve"> </w:t>
+      </w:r>
+      <w:r>
+        <w:t xml:space="preserve">which is the strict counterpart of</w:t>
+      </w:r>
+      <w:r>
+        <w:t xml:space="preserve"> </w:t>
+      </w:r>
+      <w:hyperlink w:anchor="def-big-o">
+        <w:r>
+          <w:rPr>
+            <w:rStyle w:val="Hyperlink"/>
+          </w:rPr>
+          <w:t xml:space="preserve">Definition 1</w:t>
+        </w:r>
+      </w:hyperlink>
+      <w:r>
+        <w:t xml:space="preserve">.</w:t>
+      </w:r>
+      <w:r>
+        <w:t xml:space="preserve"> </w:t>
+      </w:r>
+      <w:r>
+        <w:t xml:space="preserve">In this case we also say that</w:t>
+      </w:r>
+      <w:r>
+        <w:t xml:space="preserve"> </w:t>
+      </w:r>
+      <m:oMath>
+        <m:r>
+          <m:t>g</m:t>
+        </m:r>
+        <m:r>
+          <m:rPr>
+            <m:sty m:val="p"/>
+          </m:rPr>
+          <m:t>(</m:t>
+        </m:r>
+        <m:r>
+          <m:t>n</m:t>
+        </m:r>
+        <m:r>
+          <m:rPr>
+            <m:sty m:val="p"/>
+          </m:rPr>
+          <m:t>)</m:t>
+        </m:r>
+      </m:oMath>
+      <w:r>
+        <w:t xml:space="preserve"> </w:t>
+      </w:r>
+      <w:r>
+        <w:rPr>
+          <w:b/>
+          <w:bCs/>
+        </w:rPr>
+        <w:t xml:space="preserve">dominates</w:t>
+      </w:r>
+      <w:r>
+        <w:t xml:space="preserve"> </w:t>
+      </w:r>
+      <m:oMath>
+        <m:r>
+          <m:t>f</m:t>
+        </m:r>
+        <m:r>
+          <m:rPr>
+            <m:sty m:val="p"/>
+          </m:rPr>
+          <m:t>(</m:t>
+        </m:r>
+        <m:r>
+          <m:t>n</m:t>
+        </m:r>
+        <m:r>
+          <m:rPr>
+            <m:sty m:val="p"/>
+          </m:rPr>
+          <m:t>)</m:t>
+        </m:r>
+      </m:oMath>
+      <w:r>
+        <w:t xml:space="preserve">.</w:t>
+      </w:r>
+    </w:p>
+    <w:bookmarkEnd w:id="14"/>
+    <w:bookmarkStart w:id="16" w:name="exm-cubic-dominates-quadratic"/>
+    <w:p>
+      <w:pPr>
+        <w:pStyle w:val="BodyText"/>
+      </w:pPr>
+      <w:r>
+        <w:rPr>
+          <w:b/>
+          <w:bCs/>
+        </w:rPr>
+        <w:t xml:space="preserve">Example 1</w:t>
+      </w:r>
+      <w:r>
+        <w:t xml:space="preserve"> </w:t>
+      </w:r>
+      <w:r>
+        <w:t xml:space="preserve"> </w:t>
+      </w:r>
+    </w:p>
+    <w:bookmarkStart w:id="15" w:name="a-cubic-dominates-a-quadratic"/>
+    <w:p>
+      <w:pPr>
+        <w:pStyle w:val="Heading4"/>
+      </w:pPr>
+      <w:r>
+        <w:t xml:space="preserve">A cubic dominates a quadratic</w:t>
+      </w:r>
+    </w:p>
+    <w:p>
+      <w:pPr>
+        <w:pStyle w:val="FirstParagraph"/>
+      </w:pPr>
+      <w:r>
+        <w:t xml:space="preserve">Let</w:t>
+      </w:r>
+      <w:r>
+        <w:t xml:space="preserve"> </w:t>
+      </w:r>
+      <m:oMath>
+        <m:r>
+          <m:t>f</m:t>
+        </m:r>
+        <m:r>
+          <m:rPr>
+            <m:sty m:val="p"/>
+          </m:rPr>
+          <m:t>(</m:t>
+        </m:r>
+        <m:r>
+          <m:t>n</m:t>
+        </m:r>
+        <m:r>
+          <m:rPr>
+            <m:sty m:val="p"/>
+          </m:rPr>
+          <m:t>)</m:t>
+        </m:r>
+        <m:r>
+          <m:rPr>
+            <m:sty m:val="p"/>
+          </m:rPr>
+          <m:t>=</m:t>
+        </m:r>
+        <m:sSup>
+          <m:e>
+            <m:r>
+              <m:t>n</m:t>
+            </m:r>
+          </m:e>
+          <m:sup>
+            <m:r>
+              <m:t>2</m:t>
+            </m:r>
+          </m:sup>
+        </m:sSup>
+      </m:oMath>
+      <w:r>
+        <w:t xml:space="preserve"> </w:t>
+      </w:r>
+      <w:r>
+        <w:t xml:space="preserve">and</w:t>
+      </w:r>
+      <w:r>
+        <w:t xml:space="preserve"> </w:t>
+      </w:r>
+      <m:oMath>
+        <m:r>
+          <m:t>g</m:t>
+        </m:r>
+        <m:r>
+          <m:rPr>
+            <m:sty m:val="p"/>
+          </m:rPr>
+          <m:t>(</m:t>
+        </m:r>
+        <m:r>
+          <m:t>n</m:t>
+        </m:r>
+        <m:r>
+          <m:rPr>
+            <m:sty m:val="p"/>
+          </m:rPr>
+          <m:t>)</m:t>
+        </m:r>
+        <m:r>
+          <m:rPr>
+            <m:sty m:val="p"/>
+          </m:rPr>
+          <m:t>=</m:t>
+        </m:r>
+        <m:sSup>
+          <m:e>
+            <m:r>
+              <m:t>n</m:t>
+            </m:r>
+          </m:e>
+          <m:sup>
+            <m:r>
+              <m:t>3</m:t>
+            </m:r>
+          </m:sup>
+        </m:sSup>
+      </m:oMath>
+      <w:r>
+        <w:t xml:space="preserve">.</w:t>
+      </w:r>
+      <w:r>
+        <w:t xml:space="preserve"> </w:t>
+      </w:r>
+      <w:r>
+        <w:t xml:space="preserve">Let</w:t>
+      </w:r>
+      <w:r>
+        <w:t xml:space="preserve"> </w:t>
+      </w:r>
+      <m:oMath>
+        <m:r>
+          <m:t>ε</m:t>
+        </m:r>
+        <m:r>
+          <m:rPr>
+            <m:sty m:val="p"/>
+          </m:rPr>
+          <m:t>&gt;</m:t>
+        </m:r>
+        <m:r>
+          <m:t>0</m:t>
+        </m:r>
+      </m:oMath>
+      <w:r>
+        <w:t xml:space="preserve">.</w:t>
+      </w:r>
+      <w:r>
+        <w:t xml:space="preserve"> </w:t>
+      </w:r>
+      <w:r>
+        <w:t xml:space="preserve">Choose an integer</w:t>
+      </w:r>
+      <w:r>
+        <w:t xml:space="preserve"> </w:t>
+      </w:r>
+      <m:oMath>
+        <m:sSub>
+          <m:e>
+            <m:r>
+              <m:t>n</m:t>
+            </m:r>
+          </m:e>
+          <m:sub>
+            <m:r>
+              <m:t>0</m:t>
+            </m:r>
+          </m:sub>
+        </m:sSub>
+        <m:r>
+          <m:rPr>
+            <m:sty m:val="p"/>
+          </m:rPr>
+          <m:t>≥</m:t>
+        </m:r>
+        <m:r>
+          <m:t>1</m:t>
+        </m:r>
+        <m:r>
+          <m:rPr>
+            <m:sty m:val="p"/>
+          </m:rPr>
+          <m:t>/</m:t>
+        </m:r>
+        <m:r>
+          <m:t>ε</m:t>
+        </m:r>
+      </m:oMath>
+      <w:r>
+        <w:t xml:space="preserve">.</w:t>
+      </w:r>
+      <w:r>
+        <w:t xml:space="preserve"> </w:t>
+      </w:r>
+      <w:r>
+        <w:t xml:space="preserve">For every</w:t>
+      </w:r>
+      <w:r>
+        <w:t xml:space="preserve"> </w:t>
+      </w:r>
+      <m:oMath>
+        <m:r>
+          <m:t>n</m:t>
+        </m:r>
+        <m:r>
+          <m:rPr>
+            <m:sty m:val="p"/>
+          </m:rPr>
+          <m:t>≥</m:t>
+        </m:r>
+        <m:sSub>
+          <m:e>
+            <m:r>
+              <m:t>n</m:t>
+            </m:r>
+          </m:e>
+          <m:sub>
+            <m:r>
+              <m:t>0</m:t>
+            </m:r>
+          </m:sub>
+        </m:sSub>
+      </m:oMath>
+      <w:r>
+        <w:t xml:space="preserve"> </w:t>
+      </w:r>
+      <w:r>
+        <w:t xml:space="preserve">we have</w:t>
+      </w:r>
+      <w:r>
+        <w:t xml:space="preserve"> </w:t>
+      </w:r>
+      <m:oMath>
+        <m:r>
+          <m:t>1</m:t>
+        </m:r>
+        <m:r>
+          <m:rPr>
+            <m:sty m:val="p"/>
+          </m:rPr>
+          <m:t>/</m:t>
+        </m:r>
+        <m:r>
+          <m:t>n</m:t>
+        </m:r>
+        <m:r>
+          <m:rPr>
+            <m:sty m:val="p"/>
+          </m:rPr>
+          <m:t>≤</m:t>
+        </m:r>
+        <m:r>
+          <m:t>1</m:t>
+        </m:r>
+        <m:r>
+          <m:rPr>
+            <m:sty m:val="p"/>
+          </m:rPr>
+          <m:t>/</m:t>
+        </m:r>
+        <m:sSub>
+          <m:e>
+            <m:r>
+              <m:t>n</m:t>
+            </m:r>
+          </m:e>
+          <m:sub>
+            <m:r>
+              <m:t>0</m:t>
+            </m:r>
+          </m:sub>
+        </m:sSub>
+        <m:r>
+          <m:rPr>
+            <m:sty m:val="p"/>
+          </m:rPr>
+          <m:t>≤</m:t>
+        </m:r>
+        <m:r>
+          <m:t>ε</m:t>
+        </m:r>
+      </m:oMath>
+      <w:r>
+        <w:t xml:space="preserve">, so</w:t>
+      </w:r>
+    </w:p>
+    <w:p>
+      <w:pPr>
+        <w:pStyle w:val="BodyText"/>
+      </w:pPr>
+      <m:oMathPara>
+        <m:oMathParaPr>
+          <m:jc m:val="center"/>
+        </m:oMathParaPr>
+        <m:oMath>
+          <m:r>
+            <m:t>f</m:t>
+          </m:r>
+          <m:r>
+            <m:rPr>
+              <m:sty m:val="p"/>
+            </m:rPr>
+            <m:t>(</m:t>
+          </m:r>
+          <m:r>
+            <m:t>n</m:t>
+          </m:r>
+          <m:r>
+            <m:rPr>
+              <m:sty m:val="p"/>
+            </m:rPr>
+            <m:t>)</m:t>
+          </m:r>
+          <m:r>
+            <m:rPr>
+              <m:sty m:val="p"/>
+            </m:rPr>
+            <m:t>=</m:t>
+          </m:r>
+          <m:sSup>
+            <m:e>
+              <m:r>
+                <m:t>n</m:t>
+              </m:r>
+            </m:e>
+            <m:sup>
+              <m:r>
+                <m:t>2</m:t>
+              </m:r>
+            </m:sup>
+          </m:sSup>
+          <m:r>
+            <m:rPr>
+              <m:sty m:val="p"/>
+            </m:rPr>
+            <m:t>=</m:t>
+          </m:r>
+          <m:f>
+            <m:fPr>
+              <m:type m:val="bar"/>
+            </m:fPr>
+            <m:num>
+              <m:r>
+                <m:t>1</m:t>
+              </m:r>
+            </m:num>
+            <m:den>
+              <m:r>
+                <m:t>n</m:t>
+              </m:r>
+            </m:den>
+          </m:f>
+          <m:r>
+            <m:t> </m:t>
+          </m:r>
+          <m:sSup>
+            <m:e>
+              <m:r>
+                <m:t>n</m:t>
+              </m:r>
+            </m:e>
+            <m:sup>
+              <m:r>
+                <m:t>3</m:t>
+              </m:r>
+            </m:sup>
+          </m:sSup>
+          <m:r>
+            <m:rPr>
+              <m:sty m:val="p"/>
+            </m:rPr>
+            <m:t>≤</m:t>
+          </m:r>
+          <m:r>
+            <m:t>ε</m:t>
+          </m:r>
+          <m:r>
+            <m:t> </m:t>
+          </m:r>
+          <m:sSup>
+            <m:e>
+              <m:r>
+                <m:t>n</m:t>
+              </m:r>
+            </m:e>
+            <m:sup>
+              <m:r>
+                <m:t>3</m:t>
+              </m:r>
+            </m:sup>
+          </m:sSup>
+          <m:r>
+            <m:rPr>
+              <m:sty m:val="p"/>
+            </m:rPr>
+            <m:t>=</m:t>
+          </m:r>
+          <m:r>
+            <m:t>ε</m:t>
+          </m:r>
+          <m:r>
+            <m:t> </m:t>
+          </m:r>
+          <m:r>
+            <m:t>g</m:t>
+          </m:r>
+          <m:r>
+            <m:rPr>
+              <m:sty m:val="p"/>
+            </m:rPr>
+            <m:t>(</m:t>
+          </m:r>
+          <m:r>
+            <m:t>n</m:t>
+          </m:r>
+          <m:r>
+            <m:rPr>
+              <m:sty m:val="p"/>
+            </m:rPr>
+            <m:t>)</m:t>
+          </m:r>
+          <m:r>
+            <m:rPr>
+              <m:sty m:val="p"/>
+            </m:rPr>
+            <m:t>.</m:t>
+          </m:r>
+        </m:oMath>
+      </m:oMathPara>
+    </w:p>
+    <w:p>
+      <w:pPr>
+        <w:pStyle w:val="FirstParagraph"/>
+      </w:pPr>
+      <w:r>
+        <w:t xml:space="preserve">Hence</w:t>
+      </w:r>
+      <w:r>
+        <w:t xml:space="preserve"> </w:t>
+      </w:r>
+      <m:oMath>
+        <m:sSup>
+          <m:e>
+            <m:r>
+              <m:t>n</m:t>
+            </m:r>
+          </m:e>
+          <m:sup>
+            <m:r>
+              <m:t>2</m:t>
+            </m:r>
+          </m:sup>
+        </m:sSup>
+        <m:r>
+          <m:rPr>
+            <m:sty m:val="p"/>
+          </m:rPr>
+          <m:t>=</m:t>
+        </m:r>
+        <m:r>
+          <m:t>o</m:t>
+        </m:r>
+        <m:r>
+          <m:rPr>
+            <m:sty m:val="p"/>
+          </m:rPr>
+          <m:t>(</m:t>
+        </m:r>
+        <m:sSup>
+          <m:e>
+            <m:r>
+              <m:t>n</m:t>
+            </m:r>
+          </m:e>
+          <m:sup>
+            <m:r>
+              <m:t>3</m:t>
+            </m:r>
+          </m:sup>
+        </m:sSup>
+        <m:r>
+          <m:rPr>
+            <m:sty m:val="p"/>
+          </m:rPr>
+          <m:t>)</m:t>
+        </m:r>
+      </m:oMath>
+      <w:r>
+        <w:t xml:space="preserve"> </w:t>
+      </w:r>
+      <w:r>
+        <w:t xml:space="preserve">by</w:t>
+      </w:r>
+      <w:r>
+        <w:t xml:space="preserve"> </w:t>
+      </w:r>
+      <w:hyperlink w:anchor="def-little-o">
+        <w:r>
+          <w:rPr>
+            <w:rStyle w:val="Hyperlink"/>
+          </w:rPr>
+          <w:t xml:space="preserve">Definition 4</w:t>
+        </w:r>
+      </w:hyperlink>
+      <w:r>
+        <w:t xml:space="preserve">, so</w:t>
+      </w:r>
+      <w:r>
+        <w:t xml:space="preserve"> </w:t>
+      </w:r>
+      <m:oMath>
+        <m:sSup>
+          <m:e>
+            <m:r>
+              <m:t>n</m:t>
+            </m:r>
+          </m:e>
+          <m:sup>
+            <m:r>
+              <m:t>3</m:t>
+            </m:r>
+          </m:sup>
+        </m:sSup>
+      </m:oMath>
+      <w:r>
+        <w:t xml:space="preserve"> </w:t>
+      </w:r>
+      <w:r>
+        <w:t xml:space="preserve">dominates</w:t>
+      </w:r>
+      <w:r>
+        <w:t xml:space="preserve"> </w:t>
+      </w:r>
+      <m:oMath>
+        <m:sSup>
+          <m:e>
+            <m:r>
+              <m:t>n</m:t>
+            </m:r>
+          </m:e>
+          <m:sup>
+            <m:r>
+              <m:t>2</m:t>
+            </m:r>
+          </m:sup>
+        </m:sSup>
+      </m:oMath>
+      <w:r>
+        <w:t xml:space="preserve">.</w:t>
+      </w:r>
+    </w:p>
+    <w:bookmarkEnd w:id="15"/>
+    <w:bookmarkEnd w:id="16"/>
+    <w:bookmarkEnd w:id="17"/>
+    <w:bookmarkStart w:id="20" w:name="sec-asymptotic-examples"/>
+    <w:p>
+      <w:pPr>
+        <w:pStyle w:val="Heading2"/>
+      </w:pPr>
+      <w:r>
+        <w:t xml:space="preserve">3 Examples</w:t>
+      </w:r>
+    </w:p>
+    <w:bookmarkStart w:id="18" w:name="exm-quadratic-big-o"/>
+    <w:p>
+      <w:pPr>
+        <w:pStyle w:val="FirstParagraph"/>
+      </w:pPr>
+      <w:r>
+        <w:rPr>
+          <w:b/>
+          <w:bCs/>
+        </w:rPr>
+        <w:t xml:space="preserve">Example 2 (A quadratic is</w:t>
       </w:r>
       <w:r>
         <w:rPr>
@@ -2564,8 +3605,8 @@
         <w:t xml:space="preserve">.</w:t>
       </w:r>
     </w:p>
-    <w:bookmarkEnd w:id="14"/>
-    <w:bookmarkStart w:id="15" w:name="exm-inner-product-cost"/>
+    <w:bookmarkEnd w:id="18"/>
+    <w:bookmarkStart w:id="19" w:name="exm-inner-product-cost"/>
     <w:p>
       <w:pPr>
         <w:pStyle w:val="BodyText"/>
@@ -2575,7 +3616,7 @@
           <w:b/>
           <w:bCs/>
         </w:rPr>
-        <w:t xml:space="preserve">Example 2 (Counting the operations in an inner product)</w:t>
+        <w:t xml:space="preserve">Example 3 (Counting the operations in an inner product)</w:t>
       </w:r>
       <w:r>
         <w:t xml:space="preserve"> </w:t>
@@ -3117,9 +4158,9 @@
         <w:t xml:space="preserve">it means this count of operations, up to a constant factor.</w:t>
       </w:r>
     </w:p>
-    <w:bookmarkEnd w:id="15"/>
-    <w:bookmarkEnd w:id="16"/>
-    <w:bookmarkStart w:id="21" w:name="references"/>
+    <w:bookmarkEnd w:id="19"/>
+    <w:bookmarkEnd w:id="20"/>
+    <w:bookmarkStart w:id="25" w:name="references"/>
     <w:p>
       <w:pPr>
         <w:pStyle w:val="Heading2"/>
@@ -3128,8 +4169,8 @@
         <w:t xml:space="preserve">References</w:t>
       </w:r>
     </w:p>
-    <w:bookmarkStart w:id="20" w:name="refs"/>
-    <w:bookmarkStart w:id="18" w:name="ref-arora2009computational"/>
+    <w:bookmarkStart w:id="24" w:name="refs"/>
+    <w:bookmarkStart w:id="22" w:name="ref-arora2009computational"/>
     <w:p>
       <w:pPr>
         <w:pStyle w:val="Bibliography"/>
@@ -3153,7 +4194,7 @@
       <w:r>
         <w:t xml:space="preserve"> </w:t>
       </w:r>
-      <w:hyperlink r:id="rId17">
+      <w:hyperlink r:id="rId21">
         <w:r>
           <w:rPr>
             <w:rStyle w:val="Hyperlink"/>
@@ -3165,8 +4206,8 @@
         <w:t xml:space="preserve">.</w:t>
       </w:r>
     </w:p>
-    <w:bookmarkEnd w:id="18"/>
-    <w:bookmarkStart w:id="19" w:name="ref-cormen2009introduction"/>
+    <w:bookmarkEnd w:id="22"/>
+    <w:bookmarkStart w:id="23" w:name="ref-cormen2009introduction"/>
     <w:p>
       <w:pPr>
         <w:pStyle w:val="Bibliography"/>
@@ -3188,9 +4229,9 @@
         <w:t xml:space="preserve">. 3rd ed. MIT Press.</w:t>
       </w:r>
     </w:p>
-    <w:bookmarkEnd w:id="19"/>
-    <w:bookmarkEnd w:id="20"/>
-    <w:bookmarkEnd w:id="21"/>
+    <w:bookmarkEnd w:id="23"/>
+    <w:bookmarkEnd w:id="24"/>
+    <w:bookmarkEnd w:id="25"/>
     <w:sectPr>
       <w:footnotePr>
         <w:numRestart w:val="eachSect"/>

</xml_diff>